<commit_message>
Első lépések + 01 generálás
</commit_message>
<xml_diff>
--- a/[03] projects/tomeges-nyomtatas-endre/01_SOURCES/Tömeges tranzakciók.docx
+++ b/[03] projects/tomeges-nyomtatas-endre/01_SOURCES/Tömeges tranzakciók.docx
@@ -11,7 +11,13 @@
         <w:t xml:space="preserve">Tömeges </w:t>
       </w:r>
       <w:r>
-        <w:t>feldogozás</w:t>
+        <w:t>feldo</w:t>
+      </w:r>
+      <w:r>
+        <w:t>l</w:t>
+      </w:r>
+      <w:r>
+        <w:t>gozás</w:t>
       </w:r>
     </w:p>
     <w:p>
@@ -318,7 +324,58 @@
           <w:lang w:eastAsia="hu-HU"/>
           <w14:ligatures w14:val="none"/>
         </w:rPr>
-        <w:t>Ez a mostani előzmény: DHC-ban ZPR_DHC_EXCLUDE.  Ezt kell majd rendbe tenni.</w:t>
+        <w:t xml:space="preserve">Ez a mostani előzmény: </w:t>
+      </w:r>
+      <w:r>
+        <w:rPr>
+          <w:rFonts w:ascii="Aptos" w:eastAsia="Times New Roman" w:hAnsi="Aptos" w:cs="Times New Roman"/>
+          <w:color w:val="000000"/>
+          <w:kern w:val="0"/>
+          <w:lang w:eastAsia="hu-HU"/>
+          <w14:ligatures w14:val="none"/>
+        </w:rPr>
+        <w:br/>
+      </w:r>
+      <w:r>
+        <w:rPr>
+          <w:rFonts w:ascii="Aptos" w:eastAsia="Times New Roman" w:hAnsi="Aptos" w:cs="Times New Roman"/>
+          <w:color w:val="000000"/>
+          <w:kern w:val="0"/>
+          <w:lang w:eastAsia="hu-HU"/>
+          <w14:ligatures w14:val="none"/>
+        </w:rPr>
+        <w:t xml:space="preserve">DHC-ban </w:t>
+      </w:r>
+      <w:r>
+        <w:rPr>
+          <w:rFonts w:ascii="Aptos" w:eastAsia="Times New Roman" w:hAnsi="Aptos" w:cs="Times New Roman"/>
+          <w:color w:val="000000"/>
+          <w:kern w:val="0"/>
+          <w:lang w:eastAsia="hu-HU"/>
+          <w14:ligatures w14:val="none"/>
+        </w:rPr>
+        <w:t>ZPR_DCQM_EXCLUDE</w:t>
+      </w:r>
+      <w:r>
+        <w:rPr>
+          <w:rFonts w:ascii="Aptos" w:eastAsia="Times New Roman" w:hAnsi="Aptos" w:cs="Times New Roman"/>
+          <w:color w:val="000000"/>
+          <w:kern w:val="0"/>
+          <w:lang w:eastAsia="hu-HU"/>
+          <w14:ligatures w14:val="none"/>
+        </w:rPr>
+        <w:t>.  Ezt kell majd rendbe tenni.</w:t>
+      </w:r>
+      <w:r>
+        <w:rPr>
+          <w:rFonts w:ascii="Aptos" w:eastAsia="Times New Roman" w:hAnsi="Aptos" w:cs="Times New Roman"/>
+          <w:color w:val="000000"/>
+          <w:kern w:val="0"/>
+          <w:lang w:eastAsia="hu-HU"/>
+          <w14:ligatures w14:val="none"/>
+        </w:rPr>
+        <w:br/>
+        <w:t>tele van kiremárkolt sorral, erre nincs szükség.</w:t>
       </w:r>
     </w:p>
     <w:p>
@@ -362,6 +419,27 @@
         </w:rPr>
         <w:t>Egy az egybe, csak más a tábla</w:t>
       </w:r>
+      <w:r>
+        <w:rPr>
+          <w:rFonts w:ascii="Aptos" w:eastAsia="Times New Roman" w:hAnsi="Aptos" w:cs="Times New Roman"/>
+          <w:color w:val="000000"/>
+          <w:kern w:val="0"/>
+          <w:lang w:eastAsia="hu-HU"/>
+          <w14:ligatures w14:val="none"/>
+        </w:rPr>
+        <w:t>.</w:t>
+      </w:r>
+    </w:p>
+    <w:p>
+      <w:pPr>
+        <w:rPr>
+          <w:rFonts w:ascii="Aptos" w:eastAsia="Times New Roman" w:hAnsi="Aptos" w:cs="Times New Roman"/>
+          <w:color w:val="000000"/>
+          <w:kern w:val="0"/>
+          <w:lang w:eastAsia="hu-HU"/>
+          <w14:ligatures w14:val="none"/>
+        </w:rPr>
+      </w:pPr>
     </w:p>
     <w:p>
       <w:pPr>
@@ -402,7 +480,27 @@
           <w:lang w:eastAsia="hu-HU"/>
           <w14:ligatures w14:val="none"/>
         </w:rPr>
-        <w:t>Szelekciós képernyő: a QU5 ZEBF_PR_DC tranzakció alapján, és a szelekció pedig ZPR_DCQM táblára.</w:t>
+        <w:t>Szelekciós képernyő: a QU5 ZEBF_PR_DC tranzakció alapján, és a szelekció pedig ZPR</w:t>
+      </w:r>
+      <w:r>
+        <w:rPr>
+          <w:rFonts w:ascii="Aptos" w:eastAsia="Times New Roman" w:hAnsi="Aptos" w:cs="Times New Roman"/>
+          <w:color w:val="000000"/>
+          <w:kern w:val="0"/>
+          <w:lang w:eastAsia="hu-HU"/>
+          <w14:ligatures w14:val="none"/>
+        </w:rPr>
+        <w:t>T</w:t>
+      </w:r>
+      <w:r>
+        <w:rPr>
+          <w:rFonts w:ascii="Aptos" w:eastAsia="Times New Roman" w:hAnsi="Aptos" w:cs="Times New Roman"/>
+          <w:color w:val="000000"/>
+          <w:kern w:val="0"/>
+          <w:lang w:eastAsia="hu-HU"/>
+          <w14:ligatures w14:val="none"/>
+        </w:rPr>
+        <w:t>_DCQM táblára.</w:t>
       </w:r>
     </w:p>
     <w:p>
@@ -528,7 +626,48 @@
           <w:lang w:eastAsia="hu-HU"/>
           <w14:ligatures w14:val="none"/>
         </w:rPr>
-        <w:t>ÚJ FCS ZPR_STOCK</w:t>
+        <w:t xml:space="preserve">ÚJ </w:t>
+      </w:r>
+      <w:r>
+        <w:rPr>
+          <w:rFonts w:ascii="Aptos" w:eastAsia="Times New Roman" w:hAnsi="Aptos" w:cs="Times New Roman"/>
+          <w:color w:val="000000"/>
+          <w:kern w:val="0"/>
+          <w:lang w:eastAsia="hu-HU"/>
+          <w14:ligatures w14:val="none"/>
+        </w:rPr>
+        <w:t>függvénycsoport:</w:t>
+      </w:r>
+      <w:r>
+        <w:rPr>
+          <w:rFonts w:ascii="Aptos" w:eastAsia="Times New Roman" w:hAnsi="Aptos" w:cs="Times New Roman"/>
+          <w:color w:val="000000"/>
+          <w:kern w:val="0"/>
+          <w:lang w:eastAsia="hu-HU"/>
+          <w14:ligatures w14:val="none"/>
+        </w:rPr>
+        <w:t xml:space="preserve"> ZPR_STOCK</w:t>
+      </w:r>
+    </w:p>
+    <w:p>
+      <w:pPr>
+        <w:rPr>
+          <w:rFonts w:ascii="Aptos" w:eastAsia="Times New Roman" w:hAnsi="Aptos" w:cs="Times New Roman"/>
+          <w:color w:val="000000"/>
+          <w:kern w:val="0"/>
+          <w:lang w:eastAsia="hu-HU"/>
+          <w14:ligatures w14:val="none"/>
+        </w:rPr>
+      </w:pPr>
+      <w:r>
+        <w:rPr>
+          <w:rFonts w:ascii="Aptos" w:eastAsia="Times New Roman" w:hAnsi="Aptos" w:cs="Times New Roman"/>
+          <w:color w:val="000000"/>
+          <w:kern w:val="0"/>
+          <w:lang w:eastAsia="hu-HU"/>
+          <w14:ligatures w14:val="none"/>
+        </w:rPr>
+        <w:t>Csomagok:</w:t>
       </w:r>
     </w:p>
     <w:p>
@@ -695,6 +834,7 @@
           <w:lang w:eastAsia="hu-HU"/>
           <w14:ligatures w14:val="none"/>
         </w:rPr>
+        <w:lastRenderedPageBreak/>
         <w:t>ZEBF_PR_STOCK</w:t>
       </w:r>
     </w:p>
@@ -2352,4 +2492,10 @@
     </a:ext>
   </a:extLst>
 </a:theme>
+</file>
+
+<file path=docMetadata/LabelInfo.xml><?xml version="1.0" encoding="utf-8"?>
+<clbl:labelList xmlns:clbl="http://schemas.microsoft.com/office/2020/mipLabelMetadata">
+  <clbl:label id="{42f063bf-ce3a-473c-8609-3866002c85b0}" enabled="1" method="Standard" siteId="{b914a242-e718-443b-a47c-6b4c649d8c0a}" contentBits="0" removed="0"/>
+</clbl:labelList>
 </file>
</xml_diff>